<commit_message>
S1 bis S11 umgesetzt: d) ohne Zuordnung, f und g getauscht, Zusatzfrage in die Hinweise, Lösung für Studierende, Kopfzeile Sommersemester 2027, Protokolle (G42, D103 bis D109)
Co-Authored-By: Claude Opus 5.5 <noreply@anthropic.com>
Claude-Session: https://claude.ai/code/session_01H6HhHh1SmuARGHNzYGswr7
</commit_message>
<xml_diff>
--- a/ergebnisse/kaffee/protokolle/Entscheidungsprotokoll_2026-10-30.docx
+++ b/ergebnisse/kaffee/protokolle/Entscheidungsprotokoll_2026-10-30.docx
@@ -7064,6 +7064,152 @@
           </w:p>
         </w:tc>
       </w:tr>
+      <w:tr>
+        <w:trPr>
+          <w:cantSplit/>
+        </w:trPr>
+        <w:tc>
+          <w:tcPr>
+            <w:tcW w:type="dxa" w:w="600"/>
+            <w:tcBorders>
+              <w:top w:val="single" w:color="C9D3EE" w:sz="4"/>
+              <w:left w:val="single" w:color="C9D3EE" w:sz="4"/>
+              <w:bottom w:val="single" w:color="C9D3EE" w:sz="4"/>
+              <w:right w:val="single" w:color="C9D3EE" w:sz="4"/>
+            </w:tcBorders>
+            <w:shd w:fill="F6F8FC" w:color="auto" w:val="clear"/>
+            <w:tcMar>
+              <w:top w:type="dxa" w:w="60"/>
+              <w:left w:type="dxa" w:w="100"/>
+              <w:bottom w:type="dxa" w:w="60"/>
+              <w:right w:type="dxa" w:w="100"/>
+            </w:tcMar>
+            <w:vAlign w:val="top"/>
+          </w:tcPr>
+          <w:p>
+            <w:pPr>
+              <w:keepNext w:val="false"/>
+              <w:spacing w:after="10" w:before="10" w:line="252" w:lineRule="auto"/>
+              <w:jc w:val="left"/>
+            </w:pPr>
+            <w:r>
+              <w:rPr>
+                <w:b/>
+                <w:bCs/>
+                <w:color w:val="0025AA"/>
+                <w:sz w:val="17"/>
+                <w:szCs w:val="17"/>
+              </w:rPr>
+              <w:t xml:space="preserve">G42</w:t>
+            </w:r>
+          </w:p>
+        </w:tc>
+        <w:tc>
+          <w:tcPr>
+            <w:tcW w:type="dxa" w:w="4300"/>
+            <w:tcBorders>
+              <w:top w:val="single" w:color="C9D3EE" w:sz="4"/>
+              <w:left w:val="single" w:color="C9D3EE" w:sz="4"/>
+              <w:bottom w:val="single" w:color="C9D3EE" w:sz="4"/>
+              <w:right w:val="single" w:color="C9D3EE" w:sz="4"/>
+            </w:tcBorders>
+            <w:shd w:fill="F6F8FC" w:color="auto" w:val="clear"/>
+            <w:tcMar>
+              <w:top w:type="dxa" w:w="60"/>
+              <w:left w:type="dxa" w:w="100"/>
+              <w:bottom w:type="dxa" w:w="60"/>
+              <w:right w:type="dxa" w:w="100"/>
+            </w:tcMar>
+            <w:vAlign w:val="top"/>
+          </w:tcPr>
+          <w:p>
+            <w:pPr>
+              <w:keepNext w:val="false"/>
+              <w:spacing w:after="10" w:before="10" w:line="252" w:lineRule="auto"/>
+              <w:jc w:val="left"/>
+            </w:pPr>
+            <w:r>
+              <w:rPr>
+                <w:b w:val="false"/>
+                <w:bCs w:val="false"/>
+                <w:sz w:val="17"/>
+                <w:szCs w:val="17"/>
+              </w:rPr>
+              <w:t xml:space="preserve">Entscheidung der Tutoriumsleitung vom 30.10.2026 im Chat über die Vorschläge der zweiten Runde der Rolle S: S1 bis S11 wie empfohlen (Bericht ergebnisse/kaffee/S2_BERICHT.md, Vorlage in Aenderungsvorschlaege.md). Antworten: heißes Wasser im Raum erlaubt, Becher und Thermometer bringt die Tutoriumsleitung; Kopf der Endfassung „Sommersemester 2027“; Lösung für Studierende als eigene Fassung ohne Hinweise; Kaffee bleibt Hauptaufgabe der Sitzung (Vorschlag ohne Widerspruch)</w:t>
+            </w:r>
+          </w:p>
+        </w:tc>
+        <w:tc>
+          <w:tcPr>
+            <w:tcW w:type="dxa" w:w="600"/>
+            <w:tcBorders>
+              <w:top w:val="single" w:color="C9D3EE" w:sz="4"/>
+              <w:left w:val="single" w:color="C9D3EE" w:sz="4"/>
+              <w:bottom w:val="single" w:color="C9D3EE" w:sz="4"/>
+              <w:right w:val="single" w:color="C9D3EE" w:sz="4"/>
+            </w:tcBorders>
+            <w:shd w:fill="F6F8FC" w:color="auto" w:val="clear"/>
+            <w:tcMar>
+              <w:top w:type="dxa" w:w="60"/>
+              <w:left w:type="dxa" w:w="100"/>
+              <w:bottom w:type="dxa" w:w="60"/>
+              <w:right w:type="dxa" w:w="100"/>
+            </w:tcMar>
+            <w:vAlign w:val="top"/>
+          </w:tcPr>
+          <w:p>
+            <w:pPr>
+              <w:keepNext w:val="false"/>
+              <w:spacing w:after="10" w:before="10" w:line="252" w:lineRule="auto"/>
+              <w:jc w:val="left"/>
+            </w:pPr>
+            <w:r>
+              <w:rPr>
+                <w:b w:val="false"/>
+                <w:bCs w:val="false"/>
+                <w:sz w:val="17"/>
+                <w:szCs w:val="17"/>
+              </w:rPr>
+              <w:t xml:space="preserve">M</w:t>
+            </w:r>
+          </w:p>
+        </w:tc>
+        <w:tc>
+          <w:tcPr>
+            <w:tcW w:type="dxa" w:w="3570"/>
+            <w:tcBorders>
+              <w:top w:val="single" w:color="C9D3EE" w:sz="4"/>
+              <w:left w:val="single" w:color="C9D3EE" w:sz="4"/>
+              <w:bottom w:val="single" w:color="C9D3EE" w:sz="4"/>
+              <w:right w:val="single" w:color="C9D3EE" w:sz="4"/>
+            </w:tcBorders>
+            <w:shd w:fill="F6F8FC" w:color="auto" w:val="clear"/>
+            <w:tcMar>
+              <w:top w:type="dxa" w:w="60"/>
+              <w:left w:type="dxa" w:w="100"/>
+              <w:bottom w:type="dxa" w:w="60"/>
+              <w:right w:type="dxa" w:w="100"/>
+            </w:tcMar>
+            <w:vAlign w:val="top"/>
+          </w:tcPr>
+          <w:p>
+            <w:pPr>
+              <w:keepNext w:val="false"/>
+              <w:spacing w:after="10" w:before="10" w:line="252" w:lineRule="auto"/>
+              <w:jc w:val="left"/>
+            </w:pPr>
+            <w:r>
+              <w:rPr>
+                <w:b w:val="false"/>
+                <w:bCs w:val="false"/>
+                <w:sz w:val="17"/>
+                <w:szCs w:val="17"/>
+              </w:rPr>
+              <w:t xml:space="preserve">D67, D103 bis D109</w:t>
+            </w:r>
+          </w:p>
+        </w:tc>
+      </w:tr>
     </w:tbl>
     <w:p>
       <w:pPr>
@@ -23582,7 +23728,7 @@
                 <w:sz w:val="16"/>
                 <w:szCs w:val="16"/>
               </w:rPr>
-              <w:t xml:space="preserve">vorgeschlagen</w:t>
+              <w:t xml:space="preserve">umgesetzt; Einordnung: Hauptaufgabe der Sitzung zu Tutorium 5 (G42, 30.10.2026)</w:t>
             </w:r>
           </w:p>
         </w:tc>
@@ -32526,7 +32672,7 @@
                 <w:sz w:val="16"/>
                 <w:szCs w:val="16"/>
               </w:rPr>
-              <w:t xml:space="preserve">umgesetzt (30.10.2026, K35); h auf dem Blatt offen</w:t>
+              <w:t xml:space="preserve">umgesetzt (30.10.2026, K35); h in die Hinweise (D105)</w:t>
             </w:r>
           </w:p>
         </w:tc>
@@ -32562,6 +32708,1865 @@
                 <w:szCs w:val="16"/>
               </w:rPr>
               <w:t xml:space="preserve">Versuchsablauf wieder auf das Blatt</w:t>
+            </w:r>
+          </w:p>
+        </w:tc>
+      </w:tr>
+    </w:tbl>
+    <w:p>
+      <w:pPr>
+        <w:pStyle w:val="Heading2"/>
+      </w:pPr>
+      <w:r>
+        <w:t xml:space="preserve">3.11 Zweite Runde der Rolle S vom 30.10.2026</w:t>
+      </w:r>
+    </w:p>
+    <w:tbl>
+      <w:tblPr>
+        <w:tblW w:type="dxa" w:w="9070"/>
+        <w:tblBorders>
+          <w:top w:val="single" w:color="auto" w:sz="4"/>
+          <w:left w:val="single" w:color="auto" w:sz="4"/>
+          <w:bottom w:val="single" w:color="auto" w:sz="4"/>
+          <w:right w:val="single" w:color="auto" w:sz="4"/>
+          <w:insideH w:val="single" w:color="auto" w:sz="4"/>
+          <w:insideV w:val="single" w:color="auto" w:sz="4"/>
+        </w:tblBorders>
+      </w:tblPr>
+      <w:tblGrid>
+        <w:gridCol w:w="650"/>
+        <w:gridCol w:w="3300"/>
+        <w:gridCol w:w="1450"/>
+        <w:gridCol w:w="650"/>
+        <w:gridCol w:w="1450"/>
+        <w:gridCol w:w="1570"/>
+      </w:tblGrid>
+      <w:tr>
+        <w:trPr>
+          <w:cantSplit/>
+          <w:tblHeader/>
+        </w:trPr>
+        <w:tc>
+          <w:tcPr>
+            <w:tcW w:type="dxa" w:w="650"/>
+            <w:tcBorders>
+              <w:top w:val="single" w:color="C9D3EE" w:sz="4"/>
+              <w:left w:val="single" w:color="C9D3EE" w:sz="4"/>
+              <w:bottom w:val="single" w:color="C9D3EE" w:sz="4"/>
+              <w:right w:val="single" w:color="C9D3EE" w:sz="4"/>
+            </w:tcBorders>
+            <w:shd w:fill="0025AA" w:color="auto" w:val="clear"/>
+            <w:tcMar>
+              <w:top w:type="dxa" w:w="60"/>
+              <w:left w:type="dxa" w:w="100"/>
+              <w:bottom w:type="dxa" w:w="60"/>
+              <w:right w:type="dxa" w:w="100"/>
+            </w:tcMar>
+            <w:vAlign w:val="top"/>
+          </w:tcPr>
+          <w:p>
+            <w:pPr>
+              <w:keepNext w:val="false"/>
+              <w:spacing w:after="10" w:before="10" w:line="252" w:lineRule="auto"/>
+              <w:jc w:val="left"/>
+            </w:pPr>
+            <w:r>
+              <w:rPr>
+                <w:b/>
+                <w:bCs/>
+                <w:color w:val="FFFFFF"/>
+                <w:sz w:val="17"/>
+                <w:szCs w:val="17"/>
+              </w:rPr>
+              <w:t xml:space="preserve">Nr.</w:t>
+            </w:r>
+          </w:p>
+        </w:tc>
+        <w:tc>
+          <w:tcPr>
+            <w:tcW w:type="dxa" w:w="3300"/>
+            <w:tcBorders>
+              <w:top w:val="single" w:color="C9D3EE" w:sz="4"/>
+              <w:left w:val="single" w:color="C9D3EE" w:sz="4"/>
+              <w:bottom w:val="single" w:color="C9D3EE" w:sz="4"/>
+              <w:right w:val="single" w:color="C9D3EE" w:sz="4"/>
+            </w:tcBorders>
+            <w:shd w:fill="0025AA" w:color="auto" w:val="clear"/>
+            <w:tcMar>
+              <w:top w:type="dxa" w:w="60"/>
+              <w:left w:type="dxa" w:w="100"/>
+              <w:bottom w:type="dxa" w:w="60"/>
+              <w:right w:type="dxa" w:w="100"/>
+            </w:tcMar>
+            <w:vAlign w:val="top"/>
+          </w:tcPr>
+          <w:p>
+            <w:pPr>
+              <w:keepNext w:val="false"/>
+              <w:spacing w:after="10" w:before="10" w:line="252" w:lineRule="auto"/>
+              <w:jc w:val="left"/>
+            </w:pPr>
+            <w:r>
+              <w:rPr>
+                <w:b/>
+                <w:bCs/>
+                <w:color w:val="FFFFFF"/>
+                <w:sz w:val="17"/>
+                <w:szCs w:val="17"/>
+              </w:rPr>
+              <w:t xml:space="preserve">Gegenstand und Entscheidung</w:t>
+            </w:r>
+          </w:p>
+        </w:tc>
+        <w:tc>
+          <w:tcPr>
+            <w:tcW w:type="dxa" w:w="1450"/>
+            <w:tcBorders>
+              <w:top w:val="single" w:color="C9D3EE" w:sz="4"/>
+              <w:left w:val="single" w:color="C9D3EE" w:sz="4"/>
+              <w:bottom w:val="single" w:color="C9D3EE" w:sz="4"/>
+              <w:right w:val="single" w:color="C9D3EE" w:sz="4"/>
+            </w:tcBorders>
+            <w:shd w:fill="0025AA" w:color="auto" w:val="clear"/>
+            <w:tcMar>
+              <w:top w:type="dxa" w:w="60"/>
+              <w:left w:type="dxa" w:w="100"/>
+              <w:bottom w:type="dxa" w:w="60"/>
+              <w:right w:type="dxa" w:w="100"/>
+            </w:tcMar>
+            <w:vAlign w:val="top"/>
+          </w:tcPr>
+          <w:p>
+            <w:pPr>
+              <w:keepNext w:val="false"/>
+              <w:spacing w:after="10" w:before="10" w:line="252" w:lineRule="auto"/>
+              <w:jc w:val="left"/>
+            </w:pPr>
+            <w:r>
+              <w:rPr>
+                <w:b/>
+                <w:bCs/>
+                <w:color w:val="FFFFFF"/>
+                <w:sz w:val="17"/>
+                <w:szCs w:val="17"/>
+              </w:rPr>
+              <w:t xml:space="preserve">Grundlage</w:t>
+            </w:r>
+          </w:p>
+        </w:tc>
+        <w:tc>
+          <w:tcPr>
+            <w:tcW w:type="dxa" w:w="650"/>
+            <w:tcBorders>
+              <w:top w:val="single" w:color="C9D3EE" w:sz="4"/>
+              <w:left w:val="single" w:color="C9D3EE" w:sz="4"/>
+              <w:bottom w:val="single" w:color="C9D3EE" w:sz="4"/>
+              <w:right w:val="single" w:color="C9D3EE" w:sz="4"/>
+            </w:tcBorders>
+            <w:shd w:fill="0025AA" w:color="auto" w:val="clear"/>
+            <w:tcMar>
+              <w:top w:type="dxa" w:w="60"/>
+              <w:left w:type="dxa" w:w="100"/>
+              <w:bottom w:type="dxa" w:w="60"/>
+              <w:right w:type="dxa" w:w="100"/>
+            </w:tcMar>
+            <w:vAlign w:val="top"/>
+          </w:tcPr>
+          <w:p>
+            <w:pPr>
+              <w:keepNext w:val="false"/>
+              <w:spacing w:after="10" w:before="10" w:line="252" w:lineRule="auto"/>
+              <w:jc w:val="left"/>
+            </w:pPr>
+            <w:r>
+              <w:rPr>
+                <w:b/>
+                <w:bCs/>
+                <w:color w:val="FFFFFF"/>
+                <w:sz w:val="17"/>
+                <w:szCs w:val="17"/>
+              </w:rPr>
+              <w:t xml:space="preserve">Von</w:t>
+            </w:r>
+          </w:p>
+        </w:tc>
+        <w:tc>
+          <w:tcPr>
+            <w:tcW w:type="dxa" w:w="1450"/>
+            <w:tcBorders>
+              <w:top w:val="single" w:color="C9D3EE" w:sz="4"/>
+              <w:left w:val="single" w:color="C9D3EE" w:sz="4"/>
+              <w:bottom w:val="single" w:color="C9D3EE" w:sz="4"/>
+              <w:right w:val="single" w:color="C9D3EE" w:sz="4"/>
+            </w:tcBorders>
+            <w:shd w:fill="0025AA" w:color="auto" w:val="clear"/>
+            <w:tcMar>
+              <w:top w:type="dxa" w:w="60"/>
+              <w:left w:type="dxa" w:w="100"/>
+              <w:bottom w:type="dxa" w:w="60"/>
+              <w:right w:type="dxa" w:w="100"/>
+            </w:tcMar>
+            <w:vAlign w:val="top"/>
+          </w:tcPr>
+          <w:p>
+            <w:pPr>
+              <w:keepNext w:val="false"/>
+              <w:spacing w:after="10" w:before="10" w:line="252" w:lineRule="auto"/>
+              <w:jc w:val="left"/>
+            </w:pPr>
+            <w:r>
+              <w:rPr>
+                <w:b/>
+                <w:bCs/>
+                <w:color w:val="FFFFFF"/>
+                <w:sz w:val="17"/>
+                <w:szCs w:val="17"/>
+              </w:rPr>
+              <w:t xml:space="preserve">Status</w:t>
+            </w:r>
+          </w:p>
+        </w:tc>
+        <w:tc>
+          <w:tcPr>
+            <w:tcW w:type="dxa" w:w="1570"/>
+            <w:tcBorders>
+              <w:top w:val="single" w:color="C9D3EE" w:sz="4"/>
+              <w:left w:val="single" w:color="C9D3EE" w:sz="4"/>
+              <w:bottom w:val="single" w:color="C9D3EE" w:sz="4"/>
+              <w:right w:val="single" w:color="C9D3EE" w:sz="4"/>
+            </w:tcBorders>
+            <w:shd w:fill="0025AA" w:color="auto" w:val="clear"/>
+            <w:tcMar>
+              <w:top w:type="dxa" w:w="60"/>
+              <w:left w:type="dxa" w:w="100"/>
+              <w:bottom w:type="dxa" w:w="60"/>
+              <w:right w:type="dxa" w:w="100"/>
+            </w:tcMar>
+            <w:vAlign w:val="top"/>
+          </w:tcPr>
+          <w:p>
+            <w:pPr>
+              <w:keepNext w:val="false"/>
+              <w:spacing w:after="10" w:before="10" w:line="252" w:lineRule="auto"/>
+              <w:jc w:val="left"/>
+            </w:pPr>
+            <w:r>
+              <w:rPr>
+                <w:b/>
+                <w:bCs/>
+                <w:color w:val="FFFFFF"/>
+                <w:sz w:val="17"/>
+                <w:szCs w:val="17"/>
+              </w:rPr>
+              <w:t xml:space="preserve">Rückweg</w:t>
+            </w:r>
+          </w:p>
+        </w:tc>
+      </w:tr>
+      <w:tr>
+        <w:trPr>
+          <w:cantSplit/>
+        </w:trPr>
+        <w:tc>
+          <w:tcPr>
+            <w:tcW w:type="dxa" w:w="650"/>
+            <w:tcBorders>
+              <w:top w:val="single" w:color="C9D3EE" w:sz="4"/>
+              <w:left w:val="single" w:color="C9D3EE" w:sz="4"/>
+              <w:bottom w:val="single" w:color="C9D3EE" w:sz="4"/>
+              <w:right w:val="single" w:color="C9D3EE" w:sz="4"/>
+            </w:tcBorders>
+            <w:tcMar>
+              <w:top w:type="dxa" w:w="60"/>
+              <w:left w:type="dxa" w:w="100"/>
+              <w:bottom w:type="dxa" w:w="60"/>
+              <w:right w:type="dxa" w:w="100"/>
+            </w:tcMar>
+            <w:vAlign w:val="top"/>
+          </w:tcPr>
+          <w:p>
+            <w:pPr>
+              <w:keepNext w:val="false"/>
+              <w:spacing w:after="10" w:before="10" w:line="252" w:lineRule="auto"/>
+              <w:jc w:val="left"/>
+            </w:pPr>
+            <w:r>
+              <w:rPr>
+                <w:b/>
+                <w:bCs/>
+                <w:color w:val="0025AA"/>
+                <w:sz w:val="16"/>
+                <w:szCs w:val="16"/>
+              </w:rPr>
+              <w:t xml:space="preserve">D103</w:t>
+            </w:r>
+          </w:p>
+        </w:tc>
+        <w:tc>
+          <w:tcPr>
+            <w:tcW w:type="dxa" w:w="3300"/>
+            <w:tcBorders>
+              <w:top w:val="single" w:color="C9D3EE" w:sz="4"/>
+              <w:left w:val="single" w:color="C9D3EE" w:sz="4"/>
+              <w:bottom w:val="single" w:color="C9D3EE" w:sz="4"/>
+              <w:right w:val="single" w:color="C9D3EE" w:sz="4"/>
+            </w:tcBorders>
+            <w:tcMar>
+              <w:top w:type="dxa" w:w="60"/>
+              <w:left w:type="dxa" w:w="100"/>
+              <w:bottom w:type="dxa" w:w="60"/>
+              <w:right w:type="dxa" w:w="100"/>
+            </w:tcMar>
+            <w:vAlign w:val="top"/>
+          </w:tcPr>
+          <w:p>
+            <w:pPr>
+              <w:keepNext w:val="false"/>
+              <w:spacing w:after="10" w:before="10" w:line="252" w:lineRule="auto"/>
+              <w:jc w:val="left"/>
+            </w:pPr>
+            <w:r>
+              <w:rPr>
+                <w:b w:val="false"/>
+                <w:bCs w:val="false"/>
+                <w:sz w:val="16"/>
+                <w:szCs w:val="16"/>
+              </w:rPr>
+              <w:t xml:space="preserve">Ergebnis in d) ohne Zuordnung („34,05 °C und 30,19 °C (Zuordnung selbst bestimmen)“) wie in der Milchkaffee-Frage; Frage 1 bleibt so auch beim Nacharbeiten offen (S1).</w:t>
+            </w:r>
+          </w:p>
+        </w:tc>
+        <w:tc>
+          <w:tcPr>
+            <w:tcW w:type="dxa" w:w="1450"/>
+            <w:tcBorders>
+              <w:top w:val="single" w:color="C9D3EE" w:sz="4"/>
+              <w:left w:val="single" w:color="C9D3EE" w:sz="4"/>
+              <w:bottom w:val="single" w:color="C9D3EE" w:sz="4"/>
+              <w:right w:val="single" w:color="C9D3EE" w:sz="4"/>
+            </w:tcBorders>
+            <w:tcMar>
+              <w:top w:type="dxa" w:w="60"/>
+              <w:left w:type="dxa" w:w="100"/>
+              <w:bottom w:type="dxa" w:w="60"/>
+              <w:right w:type="dxa" w:w="100"/>
+            </w:tcMar>
+            <w:vAlign w:val="top"/>
+          </w:tcPr>
+          <w:p>
+            <w:pPr>
+              <w:keepNext w:val="false"/>
+              <w:spacing w:after="10" w:before="10" w:line="252" w:lineRule="auto"/>
+              <w:jc w:val="left"/>
+            </w:pPr>
+            <w:r>
+              <w:rPr>
+                <w:b w:val="false"/>
+                <w:bCs w:val="false"/>
+                <w:sz w:val="16"/>
+                <w:szCs w:val="16"/>
+              </w:rPr>
+              <w:t xml:space="preserve">G42</w:t>
+            </w:r>
+          </w:p>
+        </w:tc>
+        <w:tc>
+          <w:tcPr>
+            <w:tcW w:type="dxa" w:w="650"/>
+            <w:tcBorders>
+              <w:top w:val="single" w:color="C9D3EE" w:sz="4"/>
+              <w:left w:val="single" w:color="C9D3EE" w:sz="4"/>
+              <w:bottom w:val="single" w:color="C9D3EE" w:sz="4"/>
+              <w:right w:val="single" w:color="C9D3EE" w:sz="4"/>
+            </w:tcBorders>
+            <w:tcMar>
+              <w:top w:type="dxa" w:w="60"/>
+              <w:left w:type="dxa" w:w="100"/>
+              <w:bottom w:type="dxa" w:w="60"/>
+              <w:right w:type="dxa" w:w="100"/>
+            </w:tcMar>
+            <w:vAlign w:val="top"/>
+          </w:tcPr>
+          <w:p>
+            <w:pPr>
+              <w:keepNext w:val="false"/>
+              <w:spacing w:after="10" w:before="10" w:line="252" w:lineRule="auto"/>
+              <w:jc w:val="left"/>
+            </w:pPr>
+            <w:r>
+              <w:rPr>
+                <w:b w:val="false"/>
+                <w:bCs w:val="false"/>
+                <w:sz w:val="16"/>
+                <w:szCs w:val="16"/>
+              </w:rPr>
+              <w:t xml:space="preserve">TL</w:t>
+            </w:r>
+          </w:p>
+        </w:tc>
+        <w:tc>
+          <w:tcPr>
+            <w:tcW w:type="dxa" w:w="1450"/>
+            <w:tcBorders>
+              <w:top w:val="single" w:color="C9D3EE" w:sz="4"/>
+              <w:left w:val="single" w:color="C9D3EE" w:sz="4"/>
+              <w:bottom w:val="single" w:color="C9D3EE" w:sz="4"/>
+              <w:right w:val="single" w:color="C9D3EE" w:sz="4"/>
+            </w:tcBorders>
+            <w:tcMar>
+              <w:top w:type="dxa" w:w="60"/>
+              <w:left w:type="dxa" w:w="100"/>
+              <w:bottom w:type="dxa" w:w="60"/>
+              <w:right w:type="dxa" w:w="100"/>
+            </w:tcMar>
+            <w:vAlign w:val="top"/>
+          </w:tcPr>
+          <w:p>
+            <w:pPr>
+              <w:keepNext w:val="false"/>
+              <w:spacing w:after="10" w:before="10" w:line="252" w:lineRule="auto"/>
+              <w:jc w:val="left"/>
+            </w:pPr>
+            <w:r>
+              <w:rPr>
+                <w:b w:val="false"/>
+                <w:bCs w:val="false"/>
+                <w:sz w:val="16"/>
+                <w:szCs w:val="16"/>
+              </w:rPr>
+              <w:t xml:space="preserve">umgesetzt (30.10.2026, K35)</w:t>
+            </w:r>
+          </w:p>
+        </w:tc>
+        <w:tc>
+          <w:tcPr>
+            <w:tcW w:type="dxa" w:w="1570"/>
+            <w:tcBorders>
+              <w:top w:val="single" w:color="C9D3EE" w:sz="4"/>
+              <w:left w:val="single" w:color="C9D3EE" w:sz="4"/>
+              <w:bottom w:val="single" w:color="C9D3EE" w:sz="4"/>
+              <w:right w:val="single" w:color="C9D3EE" w:sz="4"/>
+            </w:tcBorders>
+            <w:tcMar>
+              <w:top w:type="dxa" w:w="60"/>
+              <w:left w:type="dxa" w:w="100"/>
+              <w:bottom w:type="dxa" w:w="60"/>
+              <w:right w:type="dxa" w:w="100"/>
+            </w:tcMar>
+            <w:vAlign w:val="top"/>
+          </w:tcPr>
+          <w:p>
+            <w:pPr>
+              <w:keepNext w:val="false"/>
+              <w:spacing w:after="10" w:before="10" w:line="252" w:lineRule="auto"/>
+              <w:jc w:val="left"/>
+            </w:pPr>
+            <w:r>
+              <w:rPr>
+                <w:b w:val="false"/>
+                <w:bCs w:val="false"/>
+                <w:sz w:val="16"/>
+                <w:szCs w:val="16"/>
+              </w:rPr>
+              <w:t xml:space="preserve">Ergebnis mit Zuordnung</w:t>
+            </w:r>
+          </w:p>
+        </w:tc>
+      </w:tr>
+      <w:tr>
+        <w:trPr>
+          <w:cantSplit/>
+        </w:trPr>
+        <w:tc>
+          <w:tcPr>
+            <w:tcW w:type="dxa" w:w="650"/>
+            <w:tcBorders>
+              <w:top w:val="single" w:color="C9D3EE" w:sz="4"/>
+              <w:left w:val="single" w:color="C9D3EE" w:sz="4"/>
+              <w:bottom w:val="single" w:color="C9D3EE" w:sz="4"/>
+              <w:right w:val="single" w:color="C9D3EE" w:sz="4"/>
+            </w:tcBorders>
+            <w:shd w:fill="F6F8FC" w:color="auto" w:val="clear"/>
+            <w:tcMar>
+              <w:top w:type="dxa" w:w="60"/>
+              <w:left w:type="dxa" w:w="100"/>
+              <w:bottom w:type="dxa" w:w="60"/>
+              <w:right w:type="dxa" w:w="100"/>
+            </w:tcMar>
+            <w:vAlign w:val="top"/>
+          </w:tcPr>
+          <w:p>
+            <w:pPr>
+              <w:keepNext w:val="false"/>
+              <w:spacing w:after="10" w:before="10" w:line="252" w:lineRule="auto"/>
+              <w:jc w:val="left"/>
+            </w:pPr>
+            <w:r>
+              <w:rPr>
+                <w:b/>
+                <w:bCs/>
+                <w:color w:val="0025AA"/>
+                <w:sz w:val="16"/>
+                <w:szCs w:val="16"/>
+              </w:rPr>
+              <w:t xml:space="preserve">D104</w:t>
+            </w:r>
+          </w:p>
+        </w:tc>
+        <w:tc>
+          <w:tcPr>
+            <w:tcW w:type="dxa" w:w="3300"/>
+            <w:tcBorders>
+              <w:top w:val="single" w:color="C9D3EE" w:sz="4"/>
+              <w:left w:val="single" w:color="C9D3EE" w:sz="4"/>
+              <w:bottom w:val="single" w:color="C9D3EE" w:sz="4"/>
+              <w:right w:val="single" w:color="C9D3EE" w:sz="4"/>
+            </w:tcBorders>
+            <w:shd w:fill="F6F8FC" w:color="auto" w:val="clear"/>
+            <w:tcMar>
+              <w:top w:type="dxa" w:w="60"/>
+              <w:left w:type="dxa" w:w="100"/>
+              <w:bottom w:type="dxa" w:w="60"/>
+              <w:right w:type="dxa" w:w="100"/>
+            </w:tcMar>
+            <w:vAlign w:val="top"/>
+          </w:tcPr>
+          <w:p>
+            <w:pPr>
+              <w:keepNext w:val="false"/>
+              <w:spacing w:after="10" w:before="10" w:line="252" w:lineRule="auto"/>
+              <w:jc w:val="left"/>
+            </w:pPr>
+            <w:r>
+              <w:rPr>
+                <w:b w:val="false"/>
+                <w:bCs w:val="false"/>
+                <w:sz w:val="16"/>
+                <w:szCs w:val="16"/>
+              </w:rPr>
+              <w:t xml:space="preserve">Teile f und g getauscht, damit der Kern vor der Vertiefung steht: f ist jetzt die erwärmte Milch (Kern), g der Becher (Vertiefung); Annahme „außer in Teil g“, Tabellenköpfe, Abb. L1, Lösung, Hinweise und Zeitplan angepasst, keine Zahl geändert (S2, Variante A). Die Teilbezeichnungen in D93 bis D102 gelten für die Reihenfolge vor dem Tausch.</w:t>
+            </w:r>
+          </w:p>
+        </w:tc>
+        <w:tc>
+          <w:tcPr>
+            <w:tcW w:type="dxa" w:w="1450"/>
+            <w:tcBorders>
+              <w:top w:val="single" w:color="C9D3EE" w:sz="4"/>
+              <w:left w:val="single" w:color="C9D3EE" w:sz="4"/>
+              <w:bottom w:val="single" w:color="C9D3EE" w:sz="4"/>
+              <w:right w:val="single" w:color="C9D3EE" w:sz="4"/>
+            </w:tcBorders>
+            <w:shd w:fill="F6F8FC" w:color="auto" w:val="clear"/>
+            <w:tcMar>
+              <w:top w:type="dxa" w:w="60"/>
+              <w:left w:type="dxa" w:w="100"/>
+              <w:bottom w:type="dxa" w:w="60"/>
+              <w:right w:type="dxa" w:w="100"/>
+            </w:tcMar>
+            <w:vAlign w:val="top"/>
+          </w:tcPr>
+          <w:p>
+            <w:pPr>
+              <w:keepNext w:val="false"/>
+              <w:spacing w:after="10" w:before="10" w:line="252" w:lineRule="auto"/>
+              <w:jc w:val="left"/>
+            </w:pPr>
+            <w:r>
+              <w:rPr>
+                <w:b w:val="false"/>
+                <w:bCs w:val="false"/>
+                <w:sz w:val="16"/>
+                <w:szCs w:val="16"/>
+              </w:rPr>
+              <w:t xml:space="preserve">G42</w:t>
+            </w:r>
+          </w:p>
+        </w:tc>
+        <w:tc>
+          <w:tcPr>
+            <w:tcW w:type="dxa" w:w="650"/>
+            <w:tcBorders>
+              <w:top w:val="single" w:color="C9D3EE" w:sz="4"/>
+              <w:left w:val="single" w:color="C9D3EE" w:sz="4"/>
+              <w:bottom w:val="single" w:color="C9D3EE" w:sz="4"/>
+              <w:right w:val="single" w:color="C9D3EE" w:sz="4"/>
+            </w:tcBorders>
+            <w:shd w:fill="F6F8FC" w:color="auto" w:val="clear"/>
+            <w:tcMar>
+              <w:top w:type="dxa" w:w="60"/>
+              <w:left w:type="dxa" w:w="100"/>
+              <w:bottom w:type="dxa" w:w="60"/>
+              <w:right w:type="dxa" w:w="100"/>
+            </w:tcMar>
+            <w:vAlign w:val="top"/>
+          </w:tcPr>
+          <w:p>
+            <w:pPr>
+              <w:keepNext w:val="false"/>
+              <w:spacing w:after="10" w:before="10" w:line="252" w:lineRule="auto"/>
+              <w:jc w:val="left"/>
+            </w:pPr>
+            <w:r>
+              <w:rPr>
+                <w:b w:val="false"/>
+                <w:bCs w:val="false"/>
+                <w:sz w:val="16"/>
+                <w:szCs w:val="16"/>
+              </w:rPr>
+              <w:t xml:space="preserve">TL</w:t>
+            </w:r>
+          </w:p>
+        </w:tc>
+        <w:tc>
+          <w:tcPr>
+            <w:tcW w:type="dxa" w:w="1450"/>
+            <w:tcBorders>
+              <w:top w:val="single" w:color="C9D3EE" w:sz="4"/>
+              <w:left w:val="single" w:color="C9D3EE" w:sz="4"/>
+              <w:bottom w:val="single" w:color="C9D3EE" w:sz="4"/>
+              <w:right w:val="single" w:color="C9D3EE" w:sz="4"/>
+            </w:tcBorders>
+            <w:shd w:fill="F6F8FC" w:color="auto" w:val="clear"/>
+            <w:tcMar>
+              <w:top w:type="dxa" w:w="60"/>
+              <w:left w:type="dxa" w:w="100"/>
+              <w:bottom w:type="dxa" w:w="60"/>
+              <w:right w:type="dxa" w:w="100"/>
+            </w:tcMar>
+            <w:vAlign w:val="top"/>
+          </w:tcPr>
+          <w:p>
+            <w:pPr>
+              <w:keepNext w:val="false"/>
+              <w:spacing w:after="10" w:before="10" w:line="252" w:lineRule="auto"/>
+              <w:jc w:val="left"/>
+            </w:pPr>
+            <w:r>
+              <w:rPr>
+                <w:b w:val="false"/>
+                <w:bCs w:val="false"/>
+                <w:sz w:val="16"/>
+                <w:szCs w:val="16"/>
+              </w:rPr>
+              <w:t xml:space="preserve">umgesetzt (30.10.2026, K35)</w:t>
+            </w:r>
+          </w:p>
+        </w:tc>
+        <w:tc>
+          <w:tcPr>
+            <w:tcW w:type="dxa" w:w="1570"/>
+            <w:tcBorders>
+              <w:top w:val="single" w:color="C9D3EE" w:sz="4"/>
+              <w:left w:val="single" w:color="C9D3EE" w:sz="4"/>
+              <w:bottom w:val="single" w:color="C9D3EE" w:sz="4"/>
+              <w:right w:val="single" w:color="C9D3EE" w:sz="4"/>
+            </w:tcBorders>
+            <w:shd w:fill="F6F8FC" w:color="auto" w:val="clear"/>
+            <w:tcMar>
+              <w:top w:type="dxa" w:w="60"/>
+              <w:left w:type="dxa" w:w="100"/>
+              <w:bottom w:type="dxa" w:w="60"/>
+              <w:right w:type="dxa" w:w="100"/>
+            </w:tcMar>
+            <w:vAlign w:val="top"/>
+          </w:tcPr>
+          <w:p>
+            <w:pPr>
+              <w:keepNext w:val="false"/>
+              <w:spacing w:after="10" w:before="10" w:line="252" w:lineRule="auto"/>
+              <w:jc w:val="left"/>
+            </w:pPr>
+            <w:r>
+              <w:rPr>
+                <w:b w:val="false"/>
+                <w:bCs w:val="false"/>
+                <w:sz w:val="16"/>
+                <w:szCs w:val="16"/>
+              </w:rPr>
+              <w:t xml:space="preserve">Reihenfolge vom 30.10.2026 vormittags oder Vermerk „kann übersprungen werden“</w:t>
+            </w:r>
+          </w:p>
+        </w:tc>
+      </w:tr>
+      <w:tr>
+        <w:trPr>
+          <w:cantSplit/>
+        </w:trPr>
+        <w:tc>
+          <w:tcPr>
+            <w:tcW w:type="dxa" w:w="650"/>
+            <w:tcBorders>
+              <w:top w:val="single" w:color="C9D3EE" w:sz="4"/>
+              <w:left w:val="single" w:color="C9D3EE" w:sz="4"/>
+              <w:bottom w:val="single" w:color="C9D3EE" w:sz="4"/>
+              <w:right w:val="single" w:color="C9D3EE" w:sz="4"/>
+            </w:tcBorders>
+            <w:tcMar>
+              <w:top w:type="dxa" w:w="60"/>
+              <w:left w:type="dxa" w:w="100"/>
+              <w:bottom w:type="dxa" w:w="60"/>
+              <w:right w:type="dxa" w:w="100"/>
+            </w:tcMar>
+            <w:vAlign w:val="top"/>
+          </w:tcPr>
+          <w:p>
+            <w:pPr>
+              <w:keepNext w:val="false"/>
+              <w:spacing w:after="10" w:before="10" w:line="252" w:lineRule="auto"/>
+              <w:jc w:val="left"/>
+            </w:pPr>
+            <w:r>
+              <w:rPr>
+                <w:b/>
+                <w:bCs/>
+                <w:color w:val="0025AA"/>
+                <w:sz w:val="16"/>
+                <w:szCs w:val="16"/>
+              </w:rPr>
+              <w:t xml:space="preserve">D105</w:t>
+            </w:r>
+          </w:p>
+        </w:tc>
+        <w:tc>
+          <w:tcPr>
+            <w:tcW w:type="dxa" w:w="3300"/>
+            <w:tcBorders>
+              <w:top w:val="single" w:color="C9D3EE" w:sz="4"/>
+              <w:left w:val="single" w:color="C9D3EE" w:sz="4"/>
+              <w:bottom w:val="single" w:color="C9D3EE" w:sz="4"/>
+              <w:right w:val="single" w:color="C9D3EE" w:sz="4"/>
+            </w:tcBorders>
+            <w:tcMar>
+              <w:top w:type="dxa" w:w="60"/>
+              <w:left w:type="dxa" w:w="100"/>
+              <w:bottom w:type="dxa" w:w="60"/>
+              <w:right w:type="dxa" w:w="100"/>
+            </w:tcMar>
+            <w:vAlign w:val="top"/>
+          </w:tcPr>
+          <w:p>
+            <w:pPr>
+              <w:keepNext w:val="false"/>
+              <w:spacing w:after="10" w:before="10" w:line="252" w:lineRule="auto"/>
+              <w:jc w:val="left"/>
+            </w:pPr>
+            <w:r>
+              <w:rPr>
+                <w:b w:val="false"/>
+                <w:bCs w:val="false"/>
+                <w:sz w:val="16"/>
+                <w:szCs w:val="16"/>
+              </w:rPr>
+              <w:t xml:space="preserve">Die Zusatzfrage (bisher h) steht nicht mehr auf dem Blatt, sondern mit Lösung in den Hinweisen für die Tutoriumsleitung; Auftrag zu (2) präzisiert („Schätzen Sie ab, wie viel Wärme die Milch höchstens aufnehmen kann, und vergleichen Sie mit </w:t>
+            </w:r>
+            <w:r>
+              <w:rPr>
+                <w:b w:val="false"/>
+                <w:bCs w:val="false"/>
+                <w:i/>
+                <w:iCs/>
+                <w:sz w:val="16"/>
+                <w:szCs w:val="16"/>
+              </w:rPr>
+              <w:t xml:space="preserve">Q</w:t>
+            </w:r>
+            <w:r>
+              <w:rPr>
+                <w:b w:val="false"/>
+                <w:bCs w:val="false"/>
+                <w:sz w:val="16"/>
+                <w:szCs w:val="16"/>
+                <w:vertAlign w:val="subscript"/>
+              </w:rPr>
+              <w:t xml:space="preserve">2</w:t>
+            </w:r>
+            <w:r>
+              <w:rPr>
+                <w:b w:val="false"/>
+                <w:bCs w:val="false"/>
+                <w:sz w:val="16"/>
+                <w:szCs w:val="16"/>
+              </w:rPr>
+              <w:t xml:space="preserve"> − </w:t>
+            </w:r>
+            <w:r>
+              <w:rPr>
+                <w:b w:val="false"/>
+                <w:bCs w:val="false"/>
+                <w:i/>
+                <w:iCs/>
+                <w:sz w:val="16"/>
+                <w:szCs w:val="16"/>
+              </w:rPr>
+              <w:t xml:space="preserve">Q</w:t>
+            </w:r>
+            <w:r>
+              <w:rPr>
+                <w:b w:val="false"/>
+                <w:bCs w:val="false"/>
+                <w:sz w:val="16"/>
+                <w:szCs w:val="16"/>
+                <w:vertAlign w:val="subscript"/>
+              </w:rPr>
+              <w:t xml:space="preserve">1</w:t>
+            </w:r>
+            <w:r>
+              <w:rPr>
+                <w:b w:val="false"/>
+                <w:bCs w:val="false"/>
+                <w:sz w:val="16"/>
+                <w:szCs w:val="16"/>
+              </w:rPr>
+              <w:t xml:space="preserve"> aus e).“), Kontrollwerte 47,0 °C und </w:t>
+            </w:r>
+            <w:r>
+              <w:rPr>
+                <w:b w:val="false"/>
+                <w:bCs w:val="false"/>
+                <w:i/>
+                <w:iCs/>
+                <w:sz w:val="16"/>
+                <w:szCs w:val="16"/>
+              </w:rPr>
+              <w:t xml:space="preserve">Q</w:t>
+            </w:r>
+            <w:r>
+              <w:rPr>
+                <w:b w:val="false"/>
+                <w:bCs w:val="false"/>
+                <w:sz w:val="16"/>
+                <w:szCs w:val="16"/>
+                <w:vertAlign w:val="subscript"/>
+              </w:rPr>
+              <w:t xml:space="preserve">M</w:t>
+            </w:r>
+            <w:r>
+              <w:rPr>
+                <w:b w:val="false"/>
+                <w:bCs w:val="false"/>
+                <w:sz w:val="16"/>
+                <w:szCs w:val="16"/>
+              </w:rPr>
+              <w:t xml:space="preserve"> ≤ 1,83 kJ ohne Schlussfolgerung. Aufgabe 1 hat damit 397 statt 441 Wörter (Strukturvorlage etwa 175 bis 425) (S4, S11).</w:t>
+            </w:r>
+          </w:p>
+        </w:tc>
+        <w:tc>
+          <w:tcPr>
+            <w:tcW w:type="dxa" w:w="1450"/>
+            <w:tcBorders>
+              <w:top w:val="single" w:color="C9D3EE" w:sz="4"/>
+              <w:left w:val="single" w:color="C9D3EE" w:sz="4"/>
+              <w:bottom w:val="single" w:color="C9D3EE" w:sz="4"/>
+              <w:right w:val="single" w:color="C9D3EE" w:sz="4"/>
+            </w:tcBorders>
+            <w:tcMar>
+              <w:top w:type="dxa" w:w="60"/>
+              <w:left w:type="dxa" w:w="100"/>
+              <w:bottom w:type="dxa" w:w="60"/>
+              <w:right w:type="dxa" w:w="100"/>
+            </w:tcMar>
+            <w:vAlign w:val="top"/>
+          </w:tcPr>
+          <w:p>
+            <w:pPr>
+              <w:keepNext w:val="false"/>
+              <w:spacing w:after="10" w:before="10" w:line="252" w:lineRule="auto"/>
+              <w:jc w:val="left"/>
+            </w:pPr>
+            <w:r>
+              <w:rPr>
+                <w:b w:val="false"/>
+                <w:bCs w:val="false"/>
+                <w:sz w:val="16"/>
+                <w:szCs w:val="16"/>
+              </w:rPr>
+              <w:t xml:space="preserve">G41, G42</w:t>
+            </w:r>
+          </w:p>
+        </w:tc>
+        <w:tc>
+          <w:tcPr>
+            <w:tcW w:type="dxa" w:w="650"/>
+            <w:tcBorders>
+              <w:top w:val="single" w:color="C9D3EE" w:sz="4"/>
+              <w:left w:val="single" w:color="C9D3EE" w:sz="4"/>
+              <w:bottom w:val="single" w:color="C9D3EE" w:sz="4"/>
+              <w:right w:val="single" w:color="C9D3EE" w:sz="4"/>
+            </w:tcBorders>
+            <w:tcMar>
+              <w:top w:type="dxa" w:w="60"/>
+              <w:left w:type="dxa" w:w="100"/>
+              <w:bottom w:type="dxa" w:w="60"/>
+              <w:right w:type="dxa" w:w="100"/>
+            </w:tcMar>
+            <w:vAlign w:val="top"/>
+          </w:tcPr>
+          <w:p>
+            <w:pPr>
+              <w:keepNext w:val="false"/>
+              <w:spacing w:after="10" w:before="10" w:line="252" w:lineRule="auto"/>
+              <w:jc w:val="left"/>
+            </w:pPr>
+            <w:r>
+              <w:rPr>
+                <w:b w:val="false"/>
+                <w:bCs w:val="false"/>
+                <w:sz w:val="16"/>
+                <w:szCs w:val="16"/>
+              </w:rPr>
+              <w:t xml:space="preserve">TL</w:t>
+            </w:r>
+          </w:p>
+        </w:tc>
+        <w:tc>
+          <w:tcPr>
+            <w:tcW w:type="dxa" w:w="1450"/>
+            <w:tcBorders>
+              <w:top w:val="single" w:color="C9D3EE" w:sz="4"/>
+              <w:left w:val="single" w:color="C9D3EE" w:sz="4"/>
+              <w:bottom w:val="single" w:color="C9D3EE" w:sz="4"/>
+              <w:right w:val="single" w:color="C9D3EE" w:sz="4"/>
+            </w:tcBorders>
+            <w:tcMar>
+              <w:top w:type="dxa" w:w="60"/>
+              <w:left w:type="dxa" w:w="100"/>
+              <w:bottom w:type="dxa" w:w="60"/>
+              <w:right w:type="dxa" w:w="100"/>
+            </w:tcMar>
+            <w:vAlign w:val="top"/>
+          </w:tcPr>
+          <w:p>
+            <w:pPr>
+              <w:keepNext w:val="false"/>
+              <w:spacing w:after="10" w:before="10" w:line="252" w:lineRule="auto"/>
+              <w:jc w:val="left"/>
+            </w:pPr>
+            <w:r>
+              <w:rPr>
+                <w:b w:val="false"/>
+                <w:bCs w:val="false"/>
+                <w:sz w:val="16"/>
+                <w:szCs w:val="16"/>
+              </w:rPr>
+              <w:t xml:space="preserve">umgesetzt (30.10.2026, K35)</w:t>
+            </w:r>
+          </w:p>
+        </w:tc>
+        <w:tc>
+          <w:tcPr>
+            <w:tcW w:type="dxa" w:w="1570"/>
+            <w:tcBorders>
+              <w:top w:val="single" w:color="C9D3EE" w:sz="4"/>
+              <w:left w:val="single" w:color="C9D3EE" w:sz="4"/>
+              <w:bottom w:val="single" w:color="C9D3EE" w:sz="4"/>
+              <w:right w:val="single" w:color="C9D3EE" w:sz="4"/>
+            </w:tcBorders>
+            <w:tcMar>
+              <w:top w:type="dxa" w:w="60"/>
+              <w:left w:type="dxa" w:w="100"/>
+              <w:bottom w:type="dxa" w:w="60"/>
+              <w:right w:type="dxa" w:w="100"/>
+            </w:tcMar>
+            <w:vAlign w:val="top"/>
+          </w:tcPr>
+          <w:p>
+            <w:pPr>
+              <w:keepNext w:val="false"/>
+              <w:spacing w:after="10" w:before="10" w:line="252" w:lineRule="auto"/>
+              <w:jc w:val="left"/>
+            </w:pPr>
+            <w:r>
+              <w:rPr>
+                <w:b w:val="false"/>
+                <w:bCs w:val="false"/>
+                <w:sz w:val="16"/>
+                <w:szCs w:val="16"/>
+              </w:rPr>
+              <w:t xml:space="preserve">h wieder auf das Blatt</w:t>
+            </w:r>
+          </w:p>
+        </w:tc>
+      </w:tr>
+      <w:tr>
+        <w:trPr>
+          <w:cantSplit/>
+        </w:trPr>
+        <w:tc>
+          <w:tcPr>
+            <w:tcW w:type="dxa" w:w="650"/>
+            <w:tcBorders>
+              <w:top w:val="single" w:color="C9D3EE" w:sz="4"/>
+              <w:left w:val="single" w:color="C9D3EE" w:sz="4"/>
+              <w:bottom w:val="single" w:color="C9D3EE" w:sz="4"/>
+              <w:right w:val="single" w:color="C9D3EE" w:sz="4"/>
+            </w:tcBorders>
+            <w:shd w:fill="F6F8FC" w:color="auto" w:val="clear"/>
+            <w:tcMar>
+              <w:top w:type="dxa" w:w="60"/>
+              <w:left w:type="dxa" w:w="100"/>
+              <w:bottom w:type="dxa" w:w="60"/>
+              <w:right w:type="dxa" w:w="100"/>
+            </w:tcMar>
+            <w:vAlign w:val="top"/>
+          </w:tcPr>
+          <w:p>
+            <w:pPr>
+              <w:keepNext w:val="false"/>
+              <w:spacing w:after="10" w:before="10" w:line="252" w:lineRule="auto"/>
+              <w:jc w:val="left"/>
+            </w:pPr>
+            <w:r>
+              <w:rPr>
+                <w:b/>
+                <w:bCs/>
+                <w:color w:val="0025AA"/>
+                <w:sz w:val="16"/>
+                <w:szCs w:val="16"/>
+              </w:rPr>
+              <w:t xml:space="preserve">D106</w:t>
+            </w:r>
+          </w:p>
+        </w:tc>
+        <w:tc>
+          <w:tcPr>
+            <w:tcW w:type="dxa" w:w="3300"/>
+            <w:tcBorders>
+              <w:top w:val="single" w:color="C9D3EE" w:sz="4"/>
+              <w:left w:val="single" w:color="C9D3EE" w:sz="4"/>
+              <w:bottom w:val="single" w:color="C9D3EE" w:sz="4"/>
+              <w:right w:val="single" w:color="C9D3EE" w:sz="4"/>
+            </w:tcBorders>
+            <w:shd w:fill="F6F8FC" w:color="auto" w:val="clear"/>
+            <w:tcMar>
+              <w:top w:type="dxa" w:w="60"/>
+              <w:left w:type="dxa" w:w="100"/>
+              <w:bottom w:type="dxa" w:w="60"/>
+              <w:right w:type="dxa" w:w="100"/>
+            </w:tcMar>
+            <w:vAlign w:val="top"/>
+          </w:tcPr>
+          <w:p>
+            <w:pPr>
+              <w:keepNext w:val="false"/>
+              <w:spacing w:after="10" w:before="10" w:line="252" w:lineRule="auto"/>
+              <w:jc w:val="left"/>
+            </w:pPr>
+            <w:r>
+              <w:rPr>
+                <w:b w:val="false"/>
+                <w:bCs w:val="false"/>
+                <w:sz w:val="16"/>
+                <w:szCs w:val="16"/>
+              </w:rPr>
+              <w:t xml:space="preserve">Kleinere Ergänzungen: in b) der Ausgangspunkt „(Foliensatz 05, Folie 8)“ (S3); im Versuch „wie in Teil c (ohne Becher)“ (S5); im Zeitplan b) nach etwa 8 min gemeinsam an der Tafel und ein Haltepunkt bei Minute 50 (S6); Hilfe zu e) nur in den Hinweisen (S7); in der Lösung je ein Satz zu g (warum </w:t>
+            </w:r>
+            <w:r>
+              <w:rPr>
+                <w:b w:val="false"/>
+                <w:bCs w:val="false"/>
+                <w:i/>
+                <w:iCs/>
+                <w:sz w:val="16"/>
+                <w:szCs w:val="16"/>
+              </w:rPr>
+              <w:t xml:space="preserve">ϑ</w:t>
+            </w:r>
+            <w:r>
+              <w:rPr>
+                <w:b w:val="false"/>
+                <w:bCs w:val="false"/>
+                <w:sz w:val="16"/>
+                <w:szCs w:val="16"/>
+                <w:vertAlign w:val="subscript"/>
+              </w:rPr>
+              <w:t xml:space="preserve">1</w:t>
+            </w:r>
+            <w:r>
+              <w:rPr>
+                <w:b w:val="false"/>
+                <w:bCs w:val="false"/>
+                <w:sz w:val="16"/>
+                <w:szCs w:val="16"/>
+              </w:rPr>
+              <w:t xml:space="preserve"> fast gleich bleibt) und b (Rechnen in °C) (S8); in c genügt eine qualitative Begründung, Satz in der Lösung statt Innendurchmesser auf dem Blatt (S9); seitliche Wärmepfeile in Abb. 1 (S10).</w:t>
+            </w:r>
+          </w:p>
+        </w:tc>
+        <w:tc>
+          <w:tcPr>
+            <w:tcW w:type="dxa" w:w="1450"/>
+            <w:tcBorders>
+              <w:top w:val="single" w:color="C9D3EE" w:sz="4"/>
+              <w:left w:val="single" w:color="C9D3EE" w:sz="4"/>
+              <w:bottom w:val="single" w:color="C9D3EE" w:sz="4"/>
+              <w:right w:val="single" w:color="C9D3EE" w:sz="4"/>
+            </w:tcBorders>
+            <w:shd w:fill="F6F8FC" w:color="auto" w:val="clear"/>
+            <w:tcMar>
+              <w:top w:type="dxa" w:w="60"/>
+              <w:left w:type="dxa" w:w="100"/>
+              <w:bottom w:type="dxa" w:w="60"/>
+              <w:right w:type="dxa" w:w="100"/>
+            </w:tcMar>
+            <w:vAlign w:val="top"/>
+          </w:tcPr>
+          <w:p>
+            <w:pPr>
+              <w:keepNext w:val="false"/>
+              <w:spacing w:after="10" w:before="10" w:line="252" w:lineRule="auto"/>
+              <w:jc w:val="left"/>
+            </w:pPr>
+            <w:r>
+              <w:rPr>
+                <w:b w:val="false"/>
+                <w:bCs w:val="false"/>
+                <w:sz w:val="16"/>
+                <w:szCs w:val="16"/>
+              </w:rPr>
+              <w:t xml:space="preserve">G42</w:t>
+            </w:r>
+          </w:p>
+        </w:tc>
+        <w:tc>
+          <w:tcPr>
+            <w:tcW w:type="dxa" w:w="650"/>
+            <w:tcBorders>
+              <w:top w:val="single" w:color="C9D3EE" w:sz="4"/>
+              <w:left w:val="single" w:color="C9D3EE" w:sz="4"/>
+              <w:bottom w:val="single" w:color="C9D3EE" w:sz="4"/>
+              <w:right w:val="single" w:color="C9D3EE" w:sz="4"/>
+            </w:tcBorders>
+            <w:shd w:fill="F6F8FC" w:color="auto" w:val="clear"/>
+            <w:tcMar>
+              <w:top w:type="dxa" w:w="60"/>
+              <w:left w:type="dxa" w:w="100"/>
+              <w:bottom w:type="dxa" w:w="60"/>
+              <w:right w:type="dxa" w:w="100"/>
+            </w:tcMar>
+            <w:vAlign w:val="top"/>
+          </w:tcPr>
+          <w:p>
+            <w:pPr>
+              <w:keepNext w:val="false"/>
+              <w:spacing w:after="10" w:before="10" w:line="252" w:lineRule="auto"/>
+              <w:jc w:val="left"/>
+            </w:pPr>
+            <w:r>
+              <w:rPr>
+                <w:b w:val="false"/>
+                <w:bCs w:val="false"/>
+                <w:sz w:val="16"/>
+                <w:szCs w:val="16"/>
+              </w:rPr>
+              <w:t xml:space="preserve">TL</w:t>
+            </w:r>
+          </w:p>
+        </w:tc>
+        <w:tc>
+          <w:tcPr>
+            <w:tcW w:type="dxa" w:w="1450"/>
+            <w:tcBorders>
+              <w:top w:val="single" w:color="C9D3EE" w:sz="4"/>
+              <w:left w:val="single" w:color="C9D3EE" w:sz="4"/>
+              <w:bottom w:val="single" w:color="C9D3EE" w:sz="4"/>
+              <w:right w:val="single" w:color="C9D3EE" w:sz="4"/>
+            </w:tcBorders>
+            <w:shd w:fill="F6F8FC" w:color="auto" w:val="clear"/>
+            <w:tcMar>
+              <w:top w:type="dxa" w:w="60"/>
+              <w:left w:type="dxa" w:w="100"/>
+              <w:bottom w:type="dxa" w:w="60"/>
+              <w:right w:type="dxa" w:w="100"/>
+            </w:tcMar>
+            <w:vAlign w:val="top"/>
+          </w:tcPr>
+          <w:p>
+            <w:pPr>
+              <w:keepNext w:val="false"/>
+              <w:spacing w:after="10" w:before="10" w:line="252" w:lineRule="auto"/>
+              <w:jc w:val="left"/>
+            </w:pPr>
+            <w:r>
+              <w:rPr>
+                <w:b w:val="false"/>
+                <w:bCs w:val="false"/>
+                <w:sz w:val="16"/>
+                <w:szCs w:val="16"/>
+              </w:rPr>
+              <w:t xml:space="preserve">umgesetzt (30.10.2026, K35)</w:t>
+            </w:r>
+          </w:p>
+        </w:tc>
+        <w:tc>
+          <w:tcPr>
+            <w:tcW w:type="dxa" w:w="1570"/>
+            <w:tcBorders>
+              <w:top w:val="single" w:color="C9D3EE" w:sz="4"/>
+              <w:left w:val="single" w:color="C9D3EE" w:sz="4"/>
+              <w:bottom w:val="single" w:color="C9D3EE" w:sz="4"/>
+              <w:right w:val="single" w:color="C9D3EE" w:sz="4"/>
+            </w:tcBorders>
+            <w:shd w:fill="F6F8FC" w:color="auto" w:val="clear"/>
+            <w:tcMar>
+              <w:top w:type="dxa" w:w="60"/>
+              <w:left w:type="dxa" w:w="100"/>
+              <w:bottom w:type="dxa" w:w="60"/>
+              <w:right w:type="dxa" w:w="100"/>
+            </w:tcMar>
+            <w:vAlign w:val="top"/>
+          </w:tcPr>
+          <w:p>
+            <w:pPr>
+              <w:keepNext w:val="false"/>
+              <w:spacing w:after="10" w:before="10" w:line="252" w:lineRule="auto"/>
+              <w:jc w:val="left"/>
+            </w:pPr>
+            <w:r>
+              <w:rPr>
+                <w:b w:val="false"/>
+                <w:bCs w:val="false"/>
+                <w:sz w:val="16"/>
+                <w:szCs w:val="16"/>
+              </w:rPr>
+              <w:t xml:space="preserve">einzeln zurücknehmen</w:t>
+            </w:r>
+          </w:p>
+        </w:tc>
+      </w:tr>
+      <w:tr>
+        <w:trPr>
+          <w:cantSplit/>
+        </w:trPr>
+        <w:tc>
+          <w:tcPr>
+            <w:tcW w:type="dxa" w:w="650"/>
+            <w:tcBorders>
+              <w:top w:val="single" w:color="C9D3EE" w:sz="4"/>
+              <w:left w:val="single" w:color="C9D3EE" w:sz="4"/>
+              <w:bottom w:val="single" w:color="C9D3EE" w:sz="4"/>
+              <w:right w:val="single" w:color="C9D3EE" w:sz="4"/>
+            </w:tcBorders>
+            <w:tcMar>
+              <w:top w:type="dxa" w:w="60"/>
+              <w:left w:type="dxa" w:w="100"/>
+              <w:bottom w:type="dxa" w:w="60"/>
+              <w:right w:type="dxa" w:w="100"/>
+            </w:tcMar>
+            <w:vAlign w:val="top"/>
+          </w:tcPr>
+          <w:p>
+            <w:pPr>
+              <w:keepNext w:val="false"/>
+              <w:spacing w:after="10" w:before="10" w:line="252" w:lineRule="auto"/>
+              <w:jc w:val="left"/>
+            </w:pPr>
+            <w:r>
+              <w:rPr>
+                <w:b/>
+                <w:bCs/>
+                <w:color w:val="0025AA"/>
+                <w:sz w:val="16"/>
+                <w:szCs w:val="16"/>
+              </w:rPr>
+              <w:t xml:space="preserve">D107</w:t>
+            </w:r>
+          </w:p>
+        </w:tc>
+        <w:tc>
+          <w:tcPr>
+            <w:tcW w:type="dxa" w:w="3300"/>
+            <w:tcBorders>
+              <w:top w:val="single" w:color="C9D3EE" w:sz="4"/>
+              <w:left w:val="single" w:color="C9D3EE" w:sz="4"/>
+              <w:bottom w:val="single" w:color="C9D3EE" w:sz="4"/>
+              <w:right w:val="single" w:color="C9D3EE" w:sz="4"/>
+            </w:tcBorders>
+            <w:tcMar>
+              <w:top w:type="dxa" w:w="60"/>
+              <w:left w:type="dxa" w:w="100"/>
+              <w:bottom w:type="dxa" w:w="60"/>
+              <w:right w:type="dxa" w:w="100"/>
+            </w:tcMar>
+            <w:vAlign w:val="top"/>
+          </w:tcPr>
+          <w:p>
+            <w:pPr>
+              <w:keepNext w:val="false"/>
+              <w:spacing w:after="10" w:before="10" w:line="252" w:lineRule="auto"/>
+              <w:jc w:val="left"/>
+            </w:pPr>
+            <w:r>
+              <w:rPr>
+                <w:b w:val="false"/>
+                <w:bCs w:val="false"/>
+                <w:sz w:val="16"/>
+                <w:szCs w:val="16"/>
+              </w:rPr>
+              <w:t xml:space="preserve">Eigene Fassung der Lösung für Studierende ohne die Hinweise für die Tutoriumsleitung (Kaffee_Loesung_Studierende als PDF und Word, mit Quellen); die vollständige Lösung bleibt für die Tutoriumsleitung.</w:t>
+            </w:r>
+          </w:p>
+        </w:tc>
+        <w:tc>
+          <w:tcPr>
+            <w:tcW w:type="dxa" w:w="1450"/>
+            <w:tcBorders>
+              <w:top w:val="single" w:color="C9D3EE" w:sz="4"/>
+              <w:left w:val="single" w:color="C9D3EE" w:sz="4"/>
+              <w:bottom w:val="single" w:color="C9D3EE" w:sz="4"/>
+              <w:right w:val="single" w:color="C9D3EE" w:sz="4"/>
+            </w:tcBorders>
+            <w:tcMar>
+              <w:top w:type="dxa" w:w="60"/>
+              <w:left w:type="dxa" w:w="100"/>
+              <w:bottom w:type="dxa" w:w="60"/>
+              <w:right w:type="dxa" w:w="100"/>
+            </w:tcMar>
+            <w:vAlign w:val="top"/>
+          </w:tcPr>
+          <w:p>
+            <w:pPr>
+              <w:keepNext w:val="false"/>
+              <w:spacing w:after="10" w:before="10" w:line="252" w:lineRule="auto"/>
+              <w:jc w:val="left"/>
+            </w:pPr>
+            <w:r>
+              <w:rPr>
+                <w:b w:val="false"/>
+                <w:bCs w:val="false"/>
+                <w:sz w:val="16"/>
+                <w:szCs w:val="16"/>
+              </w:rPr>
+              <w:t xml:space="preserve">G42</w:t>
+            </w:r>
+          </w:p>
+        </w:tc>
+        <w:tc>
+          <w:tcPr>
+            <w:tcW w:type="dxa" w:w="650"/>
+            <w:tcBorders>
+              <w:top w:val="single" w:color="C9D3EE" w:sz="4"/>
+              <w:left w:val="single" w:color="C9D3EE" w:sz="4"/>
+              <w:bottom w:val="single" w:color="C9D3EE" w:sz="4"/>
+              <w:right w:val="single" w:color="C9D3EE" w:sz="4"/>
+            </w:tcBorders>
+            <w:tcMar>
+              <w:top w:type="dxa" w:w="60"/>
+              <w:left w:type="dxa" w:w="100"/>
+              <w:bottom w:type="dxa" w:w="60"/>
+              <w:right w:type="dxa" w:w="100"/>
+            </w:tcMar>
+            <w:vAlign w:val="top"/>
+          </w:tcPr>
+          <w:p>
+            <w:pPr>
+              <w:keepNext w:val="false"/>
+              <w:spacing w:after="10" w:before="10" w:line="252" w:lineRule="auto"/>
+              <w:jc w:val="left"/>
+            </w:pPr>
+            <w:r>
+              <w:rPr>
+                <w:b w:val="false"/>
+                <w:bCs w:val="false"/>
+                <w:sz w:val="16"/>
+                <w:szCs w:val="16"/>
+              </w:rPr>
+              <w:t xml:space="preserve">TL</w:t>
+            </w:r>
+          </w:p>
+        </w:tc>
+        <w:tc>
+          <w:tcPr>
+            <w:tcW w:type="dxa" w:w="1450"/>
+            <w:tcBorders>
+              <w:top w:val="single" w:color="C9D3EE" w:sz="4"/>
+              <w:left w:val="single" w:color="C9D3EE" w:sz="4"/>
+              <w:bottom w:val="single" w:color="C9D3EE" w:sz="4"/>
+              <w:right w:val="single" w:color="C9D3EE" w:sz="4"/>
+            </w:tcBorders>
+            <w:tcMar>
+              <w:top w:type="dxa" w:w="60"/>
+              <w:left w:type="dxa" w:w="100"/>
+              <w:bottom w:type="dxa" w:w="60"/>
+              <w:right w:type="dxa" w:w="100"/>
+            </w:tcMar>
+            <w:vAlign w:val="top"/>
+          </w:tcPr>
+          <w:p>
+            <w:pPr>
+              <w:keepNext w:val="false"/>
+              <w:spacing w:after="10" w:before="10" w:line="252" w:lineRule="auto"/>
+              <w:jc w:val="left"/>
+            </w:pPr>
+            <w:r>
+              <w:rPr>
+                <w:b w:val="false"/>
+                <w:bCs w:val="false"/>
+                <w:sz w:val="16"/>
+                <w:szCs w:val="16"/>
+              </w:rPr>
+              <w:t xml:space="preserve">umgesetzt (30.10.2026, K35)</w:t>
+            </w:r>
+          </w:p>
+        </w:tc>
+        <w:tc>
+          <w:tcPr>
+            <w:tcW w:type="dxa" w:w="1570"/>
+            <w:tcBorders>
+              <w:top w:val="single" w:color="C9D3EE" w:sz="4"/>
+              <w:left w:val="single" w:color="C9D3EE" w:sz="4"/>
+              <w:bottom w:val="single" w:color="C9D3EE" w:sz="4"/>
+              <w:right w:val="single" w:color="C9D3EE" w:sz="4"/>
+            </w:tcBorders>
+            <w:tcMar>
+              <w:top w:type="dxa" w:w="60"/>
+              <w:left w:type="dxa" w:w="100"/>
+              <w:bottom w:type="dxa" w:w="60"/>
+              <w:right w:type="dxa" w:w="100"/>
+            </w:tcMar>
+            <w:vAlign w:val="top"/>
+          </w:tcPr>
+          <w:p>
+            <w:pPr>
+              <w:keepNext w:val="false"/>
+              <w:spacing w:after="10" w:before="10" w:line="252" w:lineRule="auto"/>
+              <w:jc w:val="left"/>
+            </w:pPr>
+            <w:r>
+              <w:rPr>
+                <w:b w:val="false"/>
+                <w:bCs w:val="false"/>
+                <w:sz w:val="16"/>
+                <w:szCs w:val="16"/>
+              </w:rPr>
+              <w:t xml:space="preserve">eine Fassung für alle</w:t>
+            </w:r>
+          </w:p>
+        </w:tc>
+      </w:tr>
+      <w:tr>
+        <w:trPr>
+          <w:cantSplit/>
+        </w:trPr>
+        <w:tc>
+          <w:tcPr>
+            <w:tcW w:type="dxa" w:w="650"/>
+            <w:tcBorders>
+              <w:top w:val="single" w:color="C9D3EE" w:sz="4"/>
+              <w:left w:val="single" w:color="C9D3EE" w:sz="4"/>
+              <w:bottom w:val="single" w:color="C9D3EE" w:sz="4"/>
+              <w:right w:val="single" w:color="C9D3EE" w:sz="4"/>
+            </w:tcBorders>
+            <w:shd w:fill="F6F8FC" w:color="auto" w:val="clear"/>
+            <w:tcMar>
+              <w:top w:type="dxa" w:w="60"/>
+              <w:left w:type="dxa" w:w="100"/>
+              <w:bottom w:type="dxa" w:w="60"/>
+              <w:right w:type="dxa" w:w="100"/>
+            </w:tcMar>
+            <w:vAlign w:val="top"/>
+          </w:tcPr>
+          <w:p>
+            <w:pPr>
+              <w:keepNext w:val="false"/>
+              <w:spacing w:after="10" w:before="10" w:line="252" w:lineRule="auto"/>
+              <w:jc w:val="left"/>
+            </w:pPr>
+            <w:r>
+              <w:rPr>
+                <w:b/>
+                <w:bCs/>
+                <w:color w:val="0025AA"/>
+                <w:sz w:val="16"/>
+                <w:szCs w:val="16"/>
+              </w:rPr>
+              <w:t xml:space="preserve">D108</w:t>
+            </w:r>
+          </w:p>
+        </w:tc>
+        <w:tc>
+          <w:tcPr>
+            <w:tcW w:type="dxa" w:w="3300"/>
+            <w:tcBorders>
+              <w:top w:val="single" w:color="C9D3EE" w:sz="4"/>
+              <w:left w:val="single" w:color="C9D3EE" w:sz="4"/>
+              <w:bottom w:val="single" w:color="C9D3EE" w:sz="4"/>
+              <w:right w:val="single" w:color="C9D3EE" w:sz="4"/>
+            </w:tcBorders>
+            <w:shd w:fill="F6F8FC" w:color="auto" w:val="clear"/>
+            <w:tcMar>
+              <w:top w:type="dxa" w:w="60"/>
+              <w:left w:type="dxa" w:w="100"/>
+              <w:bottom w:type="dxa" w:w="60"/>
+              <w:right w:type="dxa" w:w="100"/>
+            </w:tcMar>
+            <w:vAlign w:val="top"/>
+          </w:tcPr>
+          <w:p>
+            <w:pPr>
+              <w:keepNext w:val="false"/>
+              <w:spacing w:after="10" w:before="10" w:line="252" w:lineRule="auto"/>
+              <w:jc w:val="left"/>
+            </w:pPr>
+            <w:r>
+              <w:rPr>
+                <w:b w:val="false"/>
+                <w:bCs w:val="false"/>
+                <w:sz w:val="16"/>
+                <w:szCs w:val="16"/>
+              </w:rPr>
+              <w:t xml:space="preserve">Kopfzeile von Blatt und Lösung „Sommersemester 2027“ statt „Entwurf, Stand …“; die Aufgabensammlung bleibt ein Entwurf mit Stand.</w:t>
+            </w:r>
+          </w:p>
+        </w:tc>
+        <w:tc>
+          <w:tcPr>
+            <w:tcW w:type="dxa" w:w="1450"/>
+            <w:tcBorders>
+              <w:top w:val="single" w:color="C9D3EE" w:sz="4"/>
+              <w:left w:val="single" w:color="C9D3EE" w:sz="4"/>
+              <w:bottom w:val="single" w:color="C9D3EE" w:sz="4"/>
+              <w:right w:val="single" w:color="C9D3EE" w:sz="4"/>
+            </w:tcBorders>
+            <w:shd w:fill="F6F8FC" w:color="auto" w:val="clear"/>
+            <w:tcMar>
+              <w:top w:type="dxa" w:w="60"/>
+              <w:left w:type="dxa" w:w="100"/>
+              <w:bottom w:type="dxa" w:w="60"/>
+              <w:right w:type="dxa" w:w="100"/>
+            </w:tcMar>
+            <w:vAlign w:val="top"/>
+          </w:tcPr>
+          <w:p>
+            <w:pPr>
+              <w:keepNext w:val="false"/>
+              <w:spacing w:after="10" w:before="10" w:line="252" w:lineRule="auto"/>
+              <w:jc w:val="left"/>
+            </w:pPr>
+            <w:r>
+              <w:rPr>
+                <w:b w:val="false"/>
+                <w:bCs w:val="false"/>
+                <w:sz w:val="16"/>
+                <w:szCs w:val="16"/>
+              </w:rPr>
+              <w:t xml:space="preserve">G42</w:t>
+            </w:r>
+          </w:p>
+        </w:tc>
+        <w:tc>
+          <w:tcPr>
+            <w:tcW w:type="dxa" w:w="650"/>
+            <w:tcBorders>
+              <w:top w:val="single" w:color="C9D3EE" w:sz="4"/>
+              <w:left w:val="single" w:color="C9D3EE" w:sz="4"/>
+              <w:bottom w:val="single" w:color="C9D3EE" w:sz="4"/>
+              <w:right w:val="single" w:color="C9D3EE" w:sz="4"/>
+            </w:tcBorders>
+            <w:shd w:fill="F6F8FC" w:color="auto" w:val="clear"/>
+            <w:tcMar>
+              <w:top w:type="dxa" w:w="60"/>
+              <w:left w:type="dxa" w:w="100"/>
+              <w:bottom w:type="dxa" w:w="60"/>
+              <w:right w:type="dxa" w:w="100"/>
+            </w:tcMar>
+            <w:vAlign w:val="top"/>
+          </w:tcPr>
+          <w:p>
+            <w:pPr>
+              <w:keepNext w:val="false"/>
+              <w:spacing w:after="10" w:before="10" w:line="252" w:lineRule="auto"/>
+              <w:jc w:val="left"/>
+            </w:pPr>
+            <w:r>
+              <w:rPr>
+                <w:b w:val="false"/>
+                <w:bCs w:val="false"/>
+                <w:sz w:val="16"/>
+                <w:szCs w:val="16"/>
+              </w:rPr>
+              <w:t xml:space="preserve">TL</w:t>
+            </w:r>
+          </w:p>
+        </w:tc>
+        <w:tc>
+          <w:tcPr>
+            <w:tcW w:type="dxa" w:w="1450"/>
+            <w:tcBorders>
+              <w:top w:val="single" w:color="C9D3EE" w:sz="4"/>
+              <w:left w:val="single" w:color="C9D3EE" w:sz="4"/>
+              <w:bottom w:val="single" w:color="C9D3EE" w:sz="4"/>
+              <w:right w:val="single" w:color="C9D3EE" w:sz="4"/>
+            </w:tcBorders>
+            <w:shd w:fill="F6F8FC" w:color="auto" w:val="clear"/>
+            <w:tcMar>
+              <w:top w:type="dxa" w:w="60"/>
+              <w:left w:type="dxa" w:w="100"/>
+              <w:bottom w:type="dxa" w:w="60"/>
+              <w:right w:type="dxa" w:w="100"/>
+            </w:tcMar>
+            <w:vAlign w:val="top"/>
+          </w:tcPr>
+          <w:p>
+            <w:pPr>
+              <w:keepNext w:val="false"/>
+              <w:spacing w:after="10" w:before="10" w:line="252" w:lineRule="auto"/>
+              <w:jc w:val="left"/>
+            </w:pPr>
+            <w:r>
+              <w:rPr>
+                <w:b w:val="false"/>
+                <w:bCs w:val="false"/>
+                <w:sz w:val="16"/>
+                <w:szCs w:val="16"/>
+              </w:rPr>
+              <w:t xml:space="preserve">umgesetzt (30.10.2026, K35)</w:t>
+            </w:r>
+          </w:p>
+        </w:tc>
+        <w:tc>
+          <w:tcPr>
+            <w:tcW w:type="dxa" w:w="1570"/>
+            <w:tcBorders>
+              <w:top w:val="single" w:color="C9D3EE" w:sz="4"/>
+              <w:left w:val="single" w:color="C9D3EE" w:sz="4"/>
+              <w:bottom w:val="single" w:color="C9D3EE" w:sz="4"/>
+              <w:right w:val="single" w:color="C9D3EE" w:sz="4"/>
+            </w:tcBorders>
+            <w:shd w:fill="F6F8FC" w:color="auto" w:val="clear"/>
+            <w:tcMar>
+              <w:top w:type="dxa" w:w="60"/>
+              <w:left w:type="dxa" w:w="100"/>
+              <w:bottom w:type="dxa" w:w="60"/>
+              <w:right w:type="dxa" w:w="100"/>
+            </w:tcMar>
+            <w:vAlign w:val="top"/>
+          </w:tcPr>
+          <w:p>
+            <w:pPr>
+              <w:keepNext w:val="false"/>
+              <w:spacing w:after="10" w:before="10" w:line="252" w:lineRule="auto"/>
+              <w:jc w:val="left"/>
+            </w:pPr>
+            <w:r>
+              <w:rPr>
+                <w:b w:val="false"/>
+                <w:bCs w:val="false"/>
+                <w:sz w:val="16"/>
+                <w:szCs w:val="16"/>
+              </w:rPr>
+              <w:t xml:space="preserve">Kopfzeile „Entwurf, Stand …“</w:t>
+            </w:r>
+          </w:p>
+        </w:tc>
+      </w:tr>
+      <w:tr>
+        <w:trPr>
+          <w:cantSplit/>
+        </w:trPr>
+        <w:tc>
+          <w:tcPr>
+            <w:tcW w:type="dxa" w:w="650"/>
+            <w:tcBorders>
+              <w:top w:val="single" w:color="C9D3EE" w:sz="4"/>
+              <w:left w:val="single" w:color="C9D3EE" w:sz="4"/>
+              <w:bottom w:val="single" w:color="C9D3EE" w:sz="4"/>
+              <w:right w:val="single" w:color="C9D3EE" w:sz="4"/>
+            </w:tcBorders>
+            <w:tcMar>
+              <w:top w:type="dxa" w:w="60"/>
+              <w:left w:type="dxa" w:w="100"/>
+              <w:bottom w:type="dxa" w:w="60"/>
+              <w:right w:type="dxa" w:w="100"/>
+            </w:tcMar>
+            <w:vAlign w:val="top"/>
+          </w:tcPr>
+          <w:p>
+            <w:pPr>
+              <w:keepNext w:val="false"/>
+              <w:spacing w:after="10" w:before="10" w:line="252" w:lineRule="auto"/>
+              <w:jc w:val="left"/>
+            </w:pPr>
+            <w:r>
+              <w:rPr>
+                <w:b/>
+                <w:bCs/>
+                <w:color w:val="0025AA"/>
+                <w:sz w:val="16"/>
+                <w:szCs w:val="16"/>
+              </w:rPr>
+              <w:t xml:space="preserve">D109</w:t>
+            </w:r>
+          </w:p>
+        </w:tc>
+        <w:tc>
+          <w:tcPr>
+            <w:tcW w:type="dxa" w:w="3300"/>
+            <w:tcBorders>
+              <w:top w:val="single" w:color="C9D3EE" w:sz="4"/>
+              <w:left w:val="single" w:color="C9D3EE" w:sz="4"/>
+              <w:bottom w:val="single" w:color="C9D3EE" w:sz="4"/>
+              <w:right w:val="single" w:color="C9D3EE" w:sz="4"/>
+            </w:tcBorders>
+            <w:tcMar>
+              <w:top w:type="dxa" w:w="60"/>
+              <w:left w:type="dxa" w:w="100"/>
+              <w:bottom w:type="dxa" w:w="60"/>
+              <w:right w:type="dxa" w:w="100"/>
+            </w:tcMar>
+            <w:vAlign w:val="top"/>
+          </w:tcPr>
+          <w:p>
+            <w:pPr>
+              <w:keepNext w:val="false"/>
+              <w:spacing w:after="10" w:before="10" w:line="252" w:lineRule="auto"/>
+              <w:jc w:val="left"/>
+            </w:pPr>
+            <w:r>
+              <w:rPr>
+                <w:b w:val="false"/>
+                <w:bCs w:val="false"/>
+                <w:sz w:val="16"/>
+                <w:szCs w:val="16"/>
+              </w:rPr>
+              <w:t xml:space="preserve">Versuch im Tutorium: heißes Wasser im Raum ist erlaubt; Becher, Thermometer, Thermoskanne und Kühltasche bringt die Tutoriumsleitung mit.</w:t>
+            </w:r>
+          </w:p>
+        </w:tc>
+        <w:tc>
+          <w:tcPr>
+            <w:tcW w:type="dxa" w:w="1450"/>
+            <w:tcBorders>
+              <w:top w:val="single" w:color="C9D3EE" w:sz="4"/>
+              <w:left w:val="single" w:color="C9D3EE" w:sz="4"/>
+              <w:bottom w:val="single" w:color="C9D3EE" w:sz="4"/>
+              <w:right w:val="single" w:color="C9D3EE" w:sz="4"/>
+            </w:tcBorders>
+            <w:tcMar>
+              <w:top w:type="dxa" w:w="60"/>
+              <w:left w:type="dxa" w:w="100"/>
+              <w:bottom w:type="dxa" w:w="60"/>
+              <w:right w:type="dxa" w:w="100"/>
+            </w:tcMar>
+            <w:vAlign w:val="top"/>
+          </w:tcPr>
+          <w:p>
+            <w:pPr>
+              <w:keepNext w:val="false"/>
+              <w:spacing w:after="10" w:before="10" w:line="252" w:lineRule="auto"/>
+              <w:jc w:val="left"/>
+            </w:pPr>
+            <w:r>
+              <w:rPr>
+                <w:b w:val="false"/>
+                <w:bCs w:val="false"/>
+                <w:sz w:val="16"/>
+                <w:szCs w:val="16"/>
+              </w:rPr>
+              <w:t xml:space="preserve">G42</w:t>
+            </w:r>
+          </w:p>
+        </w:tc>
+        <w:tc>
+          <w:tcPr>
+            <w:tcW w:type="dxa" w:w="650"/>
+            <w:tcBorders>
+              <w:top w:val="single" w:color="C9D3EE" w:sz="4"/>
+              <w:left w:val="single" w:color="C9D3EE" w:sz="4"/>
+              <w:bottom w:val="single" w:color="C9D3EE" w:sz="4"/>
+              <w:right w:val="single" w:color="C9D3EE" w:sz="4"/>
+            </w:tcBorders>
+            <w:tcMar>
+              <w:top w:type="dxa" w:w="60"/>
+              <w:left w:type="dxa" w:w="100"/>
+              <w:bottom w:type="dxa" w:w="60"/>
+              <w:right w:type="dxa" w:w="100"/>
+            </w:tcMar>
+            <w:vAlign w:val="top"/>
+          </w:tcPr>
+          <w:p>
+            <w:pPr>
+              <w:keepNext w:val="false"/>
+              <w:spacing w:after="10" w:before="10" w:line="252" w:lineRule="auto"/>
+              <w:jc w:val="left"/>
+            </w:pPr>
+            <w:r>
+              <w:rPr>
+                <w:b w:val="false"/>
+                <w:bCs w:val="false"/>
+                <w:sz w:val="16"/>
+                <w:szCs w:val="16"/>
+              </w:rPr>
+              <w:t xml:space="preserve">TL</w:t>
+            </w:r>
+          </w:p>
+        </w:tc>
+        <w:tc>
+          <w:tcPr>
+            <w:tcW w:type="dxa" w:w="1450"/>
+            <w:tcBorders>
+              <w:top w:val="single" w:color="C9D3EE" w:sz="4"/>
+              <w:left w:val="single" w:color="C9D3EE" w:sz="4"/>
+              <w:bottom w:val="single" w:color="C9D3EE" w:sz="4"/>
+              <w:right w:val="single" w:color="C9D3EE" w:sz="4"/>
+            </w:tcBorders>
+            <w:tcMar>
+              <w:top w:type="dxa" w:w="60"/>
+              <w:left w:type="dxa" w:w="100"/>
+              <w:bottom w:type="dxa" w:w="60"/>
+              <w:right w:type="dxa" w:w="100"/>
+            </w:tcMar>
+            <w:vAlign w:val="top"/>
+          </w:tcPr>
+          <w:p>
+            <w:pPr>
+              <w:keepNext w:val="false"/>
+              <w:spacing w:after="10" w:before="10" w:line="252" w:lineRule="auto"/>
+              <w:jc w:val="left"/>
+            </w:pPr>
+            <w:r>
+              <w:rPr>
+                <w:b w:val="false"/>
+                <w:bCs w:val="false"/>
+                <w:sz w:val="16"/>
+                <w:szCs w:val="16"/>
+              </w:rPr>
+              <w:t xml:space="preserve">entschieden</w:t>
+            </w:r>
+          </w:p>
+        </w:tc>
+        <w:tc>
+          <w:tcPr>
+            <w:tcW w:type="dxa" w:w="1570"/>
+            <w:tcBorders>
+              <w:top w:val="single" w:color="C9D3EE" w:sz="4"/>
+              <w:left w:val="single" w:color="C9D3EE" w:sz="4"/>
+              <w:bottom w:val="single" w:color="C9D3EE" w:sz="4"/>
+              <w:right w:val="single" w:color="C9D3EE" w:sz="4"/>
+            </w:tcBorders>
+            <w:tcMar>
+              <w:top w:type="dxa" w:w="60"/>
+              <w:left w:type="dxa" w:w="100"/>
+              <w:bottom w:type="dxa" w:w="60"/>
+              <w:right w:type="dxa" w:w="100"/>
+            </w:tcMar>
+            <w:vAlign w:val="top"/>
+          </w:tcPr>
+          <w:p>
+            <w:pPr>
+              <w:keepNext w:val="false"/>
+              <w:spacing w:after="10" w:before="10" w:line="252" w:lineRule="auto"/>
+              <w:jc w:val="left"/>
+            </w:pPr>
+            <w:r>
+              <w:rPr>
+                <w:b w:val="false"/>
+                <w:bCs w:val="false"/>
+                <w:sz w:val="16"/>
+                <w:szCs w:val="16"/>
+              </w:rPr>
+              <w:t xml:space="preserve">Versuch als Vorführung mit der Messreihe aus dem Probelauf</w:t>
             </w:r>
           </w:p>
         </w:tc>
@@ -32684,20 +34689,6 @@
         <w:jc w:val="left"/>
       </w:pPr>
       <w:r>
-        <w:t xml:space="preserve">Entscheidung über D67 (Einordnung der Kaffee-Aufgabe in Tutorium 5)</w:t>
-      </w:r>
-    </w:p>
-    <w:p>
-      <w:pPr>
-        <w:pStyle w:val="ListParagraph"/>
-        <w:numPr>
-          <w:ilvl w:val="0"/>
-          <w:numId w:val="2"/>
-        </w:numPr>
-        <w:spacing w:after="30" w:before="30" w:line="264" w:lineRule="auto"/>
-        <w:jc w:val="left"/>
-      </w:pPr>
-      <w:r>
         <w:t xml:space="preserve">Auswahl und Kürzung je Tutorium aus der Aufgabensammlung (D77); danach Lösungsband (D80, D85)</w:t>
       </w:r>
     </w:p>
@@ -32726,21 +34717,7 @@
         <w:jc w:val="left"/>
       </w:pPr>
       <w:r>
-        <w:t xml:space="preserve">Über die Vorschläge der zweiten Runde der Rolle S entscheiden (S1 bis S11 in ergebnisse/kaffee/Aenderungsvorschlaege.md, Bericht S2_BERICHT.md); danach Abnahmeprüfung der Kaffee-Aufgabe durch Codex und Übergabe (K35)</w:t>
-      </w:r>
-    </w:p>
-    <w:p>
-      <w:pPr>
-        <w:pStyle w:val="ListParagraph"/>
-        <w:numPr>
-          <w:ilvl w:val="0"/>
-          <w:numId w:val="2"/>
-        </w:numPr>
-        <w:spacing w:after="30" w:before="30" w:line="264" w:lineRule="auto"/>
-        <w:jc w:val="left"/>
-      </w:pPr>
-      <w:r>
-        <w:t xml:space="preserve">Kaffee-Aufgabe: h auf dem Blatt lassen oder in die Hinweise verlegen (D102); Antworten der TL zu Hauptaufgabe der Sitzung, heißem Wasser im Raum und Semester im Kopf der Endfassung</w:t>
+        <w:t xml:space="preserve">Abnahmeprüfung der Kaffee-Aufgabe durch Codex, danach Übergabe (K35)</w:t>
       </w:r>
     </w:p>
     <w:p>
@@ -34132,7 +36109,7 @@
                 <w:sz w:val="17"/>
                 <w:szCs w:val="17"/>
               </w:rPr>
-              <w:t xml:space="preserve">Entscheidung der Tutoriumsleitung über die Änderungsvorschläge und Umsetzung: Grundlage G41, Entscheidungen D93 bis D102 (Abschnitt 3.10), Status von D89 und D90 angepasst, offene Punkte aktualisiert</w:t>
+              <w:t xml:space="preserve">Entscheidung der Tutoriumsleitung über die Änderungsvorschläge und Umsetzung: Grundlage G41, Entscheidungen D93 bis D102 (Abschnitt 3.10), Status von D89 und D90 angepasst; zweite Runde der Rolle S: Grundlage G42, Entscheidungen D103 bis D109 (Abschnitt 3.11), Status von D67 und D102 angepasst; offene Punkte aktualisiert</w:t>
             </w:r>
           </w:p>
         </w:tc>

</xml_diff>